<commit_message>
Update Relatorio Tecnico Atividade 1.docx
</commit_message>
<xml_diff>
--- a/atv1/Relatorio Tecnico Atividade 1.docx
+++ b/atv1/Relatorio Tecnico Atividade 1.docx
@@ -331,7 +331,7 @@
       </w:r>
       <w:r>
         <w:pict w14:anchorId="5C2AE931">
-          <v:rect id="_x0000_i1055" style="width:0;height:1.5pt" o:hralign="center" o:hrstd="t" o:hr="t" fillcolor="gray" stroked="f"/>
+          <v:rect id="_x0000_i1025" style="width:0;height:1.5pt" o:hralign="center" o:hrstd="t" o:hr="t" fillcolor="gray" stroked="f"/>
         </w:pict>
       </w:r>
     </w:p>
@@ -452,7 +452,7 @@
       </w:r>
       <w:r>
         <w:pict w14:anchorId="07DCC177">
-          <v:rect id="_x0000_i1068" style="width:0;height:1.5pt" o:hralign="center" o:hrstd="t" o:hr="t" fillcolor="gray" stroked="f"/>
+          <v:rect id="_x0000_i1026" style="width:0;height:1.5pt" o:hralign="center" o:hrstd="t" o:hr="t" fillcolor="gray" stroked="f"/>
         </w:pict>
       </w:r>
     </w:p>
@@ -484,42 +484,14 @@
         <w:rPr>
           <w:rFonts w:ascii="Arial" w:hAnsi="Arial" w:cs="Arial"/>
         </w:rPr>
-        <w:t xml:space="preserve"> contém 41.188 registros e 21 colunas: 11 categóricas, incluindo a variável-alvo, cinco numéricas inteiras e cinco numéricas decimais. Não encontramos valores nulos, mas identificamos 12 linhas duplicadas que apresentam percentual ínfimo perante </w:t>
-      </w:r>
-      <w:proofErr w:type="gramStart"/>
-      <w:r>
-        <w:rPr>
-          <w:rFonts w:ascii="Arial" w:hAnsi="Arial" w:cs="Arial"/>
-        </w:rPr>
-        <w:t>ao</w:t>
-      </w:r>
-      <w:proofErr w:type="gramEnd"/>
-      <w:r>
-        <w:rPr>
-          <w:rFonts w:ascii="Arial" w:hAnsi="Arial" w:cs="Arial"/>
-        </w:rPr>
-        <w:t xml:space="preserve"> volume da base (0,029%). Também há a categoria “desconhecido” em seis atributos, principalmente em inadimplente (20,87%) e escolaridade (4,20%). Em </w:t>
+        <w:t xml:space="preserve"> contém 41.188 registros e 21 colunas: 11 categóricas, incluindo a variável-alvo, cinco numéricas inteiras e cinco numéricas decimais. Não encontramos valores nulos, mas identificamos 12 linhas duplicadas que apresentam percentual ínfimo perante ao volume da base (0,029%). Também há a categoria “desconhecido” em seis atributos, principalmente em inadimplente (20,87%) e escolaridade (4,20%). Em </w:t>
       </w:r>
       <w:proofErr w:type="spellStart"/>
       <w:r>
         <w:rPr>
           <w:rFonts w:ascii="Arial" w:hAnsi="Arial" w:cs="Arial"/>
         </w:rPr>
-        <w:t>dias_desde_</w:t>
-      </w:r>
-      <w:proofErr w:type="gramStart"/>
-      <w:r>
-        <w:rPr>
-          <w:rFonts w:ascii="Arial" w:hAnsi="Arial" w:cs="Arial"/>
-        </w:rPr>
-        <w:t>ultimo</w:t>
-      </w:r>
-      <w:proofErr w:type="gramEnd"/>
-      <w:r>
-        <w:rPr>
-          <w:rFonts w:ascii="Arial" w:hAnsi="Arial" w:cs="Arial"/>
-        </w:rPr>
-        <w:t>_contato</w:t>
+        <w:t>dias_desde_ultimo_contato</w:t>
       </w:r>
       <w:proofErr w:type="spellEnd"/>
       <w:r>
@@ -770,7 +742,19 @@
           <w:rFonts w:ascii="Arial" w:hAnsi="Arial" w:cs="Arial"/>
         </w:rPr>
         <w:lastRenderedPageBreak/>
-        <w:t>classificados como “sucesso” anteriormente, 65,11% aderiram nesta base; entre os de “fracasso”, foram 14,23%; e, entre os de resultado “inexistente”, 8,83%. Assim, mesmo uma recusa anterior não significa que uma nova oferta será necessariamente recusada, mesmo que um cliente tenha dito não no passado para a oferta, a probabilidade de ele aceitar uma oferta futura é de quase 1,6 maior que a de uma pessoa que nunca foi contatada. Esses percentuais descrevem os dados observados, sem demonstrar que o contato anterior causou a adesão.</w:t>
+        <w:t xml:space="preserve">classificados como “sucesso” anteriormente, 65,11% aderiram nesta base; entre os de “fracasso”, foram 14,23%; e, entre os de resultado “inexistente”, 8,83%. Assim, mesmo uma recusa anterior não significa que uma nova oferta será necessariamente recusada, mesmo que um cliente tenha dito não no passado para a oferta, </w:t>
+      </w:r>
+      <w:r>
+        <w:rPr>
+          <w:rFonts w:ascii="Arial" w:hAnsi="Arial" w:cs="Arial"/>
+        </w:rPr>
+        <w:t>a taxa de adesão observada nesse grupo é aproximadamente 1,6 vez a do grupo sem contato anterior</w:t>
+      </w:r>
+      <w:r>
+        <w:rPr>
+          <w:rFonts w:ascii="Arial" w:hAnsi="Arial" w:cs="Arial"/>
+        </w:rPr>
+        <w:t>. Esses percentuais descrevem os dados observados, sem demonstrar que o contato anterior causou a adesão.</w:t>
       </w:r>
     </w:p>
     <w:p>
@@ -808,7 +792,7 @@
           <w:u w:val="single"/>
         </w:rPr>
         <w:drawing>
-          <wp:anchor distT="0" distB="0" distL="114300" distR="114300" simplePos="0" relativeHeight="251658241" behindDoc="0" locked="0" layoutInCell="1" allowOverlap="1" wp14:anchorId="7D3B5525" wp14:editId="1263501C">
+          <wp:anchor distT="0" distB="0" distL="114300" distR="114300" simplePos="0" relativeHeight="251658241" behindDoc="0" locked="0" layoutInCell="1" allowOverlap="1" wp14:anchorId="7D3B5525" wp14:editId="122716B7">
             <wp:simplePos x="0" y="0"/>
             <wp:positionH relativeFrom="column">
               <wp:posOffset>-635</wp:posOffset>
@@ -877,7 +861,19 @@
         <w:rPr>
           <w:rFonts w:ascii="Arial" w:hAnsi="Arial" w:cs="Arial"/>
         </w:rPr>
-        <w:t>, ela é importante pois comprova a relação inversamente proporcional entre o indicador macroeconômico da variação e a taxa de adesão</w:t>
+        <w:t xml:space="preserve">, ela é importante pois </w:t>
+      </w:r>
+      <w:r>
+        <w:rPr>
+          <w:rFonts w:ascii="Arial" w:hAnsi="Arial" w:cs="Arial"/>
+        </w:rPr>
+        <w:t>mostra uma associação geral negativa</w:t>
+      </w:r>
+      <w:r>
+        <w:rPr>
+          <w:rFonts w:ascii="Arial" w:hAnsi="Arial" w:cs="Arial"/>
+        </w:rPr>
+        <w:t xml:space="preserve"> entre o indicador macroeconômico da variação e a taxa de adesão</w:t>
       </w:r>
       <w:r>
         <w:rPr>
@@ -899,25 +895,7 @@
         <w:rPr>
           <w:rFonts w:ascii="Arial" w:hAnsi="Arial" w:cs="Arial"/>
         </w:rPr>
-        <w:t>Em momentos de retração, quando mais pessoas estão desempregadas (percentuais negativos)</w:t>
-      </w:r>
-      <w:r>
-        <w:rPr>
-          <w:rFonts w:ascii="Arial" w:hAnsi="Arial" w:cs="Arial"/>
-        </w:rPr>
-        <w:t xml:space="preserve">, a taxa de sucesso de adesão sobe muito, pois o investimento </w:t>
-      </w:r>
-      <w:r>
-        <w:rPr>
-          <w:rFonts w:ascii="Arial" w:hAnsi="Arial" w:cs="Arial"/>
-        </w:rPr>
-        <w:t>conservador oferecido pela empresa (depósito a prazo)</w:t>
-      </w:r>
-      <w:r>
-        <w:rPr>
-          <w:rFonts w:ascii="Arial" w:hAnsi="Arial" w:cs="Arial"/>
-        </w:rPr>
-        <w:t xml:space="preserve"> gera uma maior sensação de proteção e estabilidade, observando que, em momento de crise, as pessoas tendem a se arriscar menos</w:t>
+        <w:t>Nos períodos de variação negativa do emprego, a taxa observada de adesão foi maior em vários grupos, mas os dados não permitem concluir que esse indicador causou a adesão</w:t>
       </w:r>
       <w:r>
         <w:rPr>
@@ -1003,27 +981,13 @@
         <w:rPr>
           <w:rFonts w:ascii="Arial" w:hAnsi="Arial" w:cs="Arial"/>
         </w:rPr>
-        <w:t xml:space="preserve"> evidencia uma clara que os clientes que aceitaram a proposta (sim) permaneceram em linha por um </w:t>
-      </w:r>
-      <w:proofErr w:type="gramStart"/>
-      <w:r>
-        <w:rPr>
-          <w:rFonts w:ascii="Arial" w:hAnsi="Arial" w:cs="Arial"/>
-        </w:rPr>
-        <w:t xml:space="preserve">período </w:t>
-      </w:r>
-      <w:r>
-        <w:rPr>
-          <w:rFonts w:ascii="Arial" w:hAnsi="Arial" w:cs="Arial"/>
-        </w:rPr>
-        <w:t>de tempo</w:t>
-      </w:r>
-      <w:proofErr w:type="gramEnd"/>
-      <w:r>
-        <w:rPr>
-          <w:rFonts w:ascii="Arial" w:hAnsi="Arial" w:cs="Arial"/>
-        </w:rPr>
-        <w:t xml:space="preserve"> </w:t>
+        <w:t xml:space="preserve"> evidencia uma clara que os clientes que aceitaram a proposta (sim) permaneceram em linha por um período </w:t>
+      </w:r>
+      <w:r>
+        <w:rPr>
+          <w:rFonts w:ascii="Arial" w:hAnsi="Arial" w:cs="Arial"/>
+        </w:rPr>
+        <w:t xml:space="preserve">de tempo </w:t>
       </w:r>
       <w:r>
         <w:rPr>
@@ -1152,7 +1116,6 @@
         <w:t xml:space="preserve">, isso se </w:t>
       </w:r>
       <w:proofErr w:type="spellStart"/>
-      <w:proofErr w:type="gramStart"/>
       <w:r>
         <w:rPr>
           <w:rFonts w:ascii="Arial" w:hAnsi="Arial" w:cs="Arial"/>
@@ -1160,7 +1123,6 @@
         <w:t>da</w:t>
       </w:r>
       <w:proofErr w:type="spellEnd"/>
-      <w:proofErr w:type="gramEnd"/>
       <w:r>
         <w:rPr>
           <w:rFonts w:ascii="Arial" w:hAnsi="Arial" w:cs="Arial"/>
@@ -1231,25 +1193,37 @@
         <w:rPr>
           <w:rFonts w:ascii="Arial" w:hAnsi="Arial" w:cs="Arial"/>
         </w:rPr>
-        <w:t xml:space="preserve"> 9,2 minutos</w:t>
-      </w:r>
-      <w:r>
-        <w:rPr>
-          <w:rFonts w:ascii="Arial" w:hAnsi="Arial" w:cs="Arial"/>
-        </w:rPr>
         <w:t xml:space="preserve"> </w:t>
       </w:r>
       <w:r>
         <w:rPr>
           <w:rFonts w:ascii="Arial" w:hAnsi="Arial" w:cs="Arial"/>
         </w:rPr>
-        <w:t xml:space="preserve">e 1 hora e 21 minutos </w:t>
-      </w:r>
-      <w:r>
-        <w:rPr>
-          <w:rFonts w:ascii="Arial" w:hAnsi="Arial" w:cs="Arial"/>
-        </w:rPr>
-        <w:t>(com 2327 chamadas)</w:t>
+        <w:t>9,27 e 81,97 minutos</w:t>
+      </w:r>
+      <w:r>
+        <w:rPr>
+          <w:rFonts w:ascii="Arial" w:hAnsi="Arial" w:cs="Arial"/>
+        </w:rPr>
+        <w:t xml:space="preserve"> </w:t>
+      </w:r>
+      <w:r>
+        <w:rPr>
+          <w:rFonts w:ascii="Arial" w:hAnsi="Arial" w:cs="Arial"/>
+        </w:rPr>
+        <w:t>(com 2</w:t>
+      </w:r>
+      <w:r>
+        <w:rPr>
+          <w:rFonts w:ascii="Arial" w:hAnsi="Arial" w:cs="Arial"/>
+        </w:rPr>
+        <w:t>179</w:t>
+      </w:r>
+      <w:r>
+        <w:rPr>
+          <w:rFonts w:ascii="Arial" w:hAnsi="Arial" w:cs="Arial"/>
+        </w:rPr>
+        <w:t xml:space="preserve"> chamadas)</w:t>
       </w:r>
       <w:r>
         <w:rPr>
@@ -1303,25 +1277,19 @@
         <w:rPr>
           <w:rFonts w:ascii="Arial" w:hAnsi="Arial" w:cs="Arial"/>
         </w:rPr>
-        <w:t xml:space="preserve"> 24,58 minutos</w:t>
-      </w:r>
-      <w:r>
-        <w:rPr>
-          <w:rFonts w:ascii="Arial" w:hAnsi="Arial" w:cs="Arial"/>
-        </w:rPr>
         <w:t xml:space="preserve"> </w:t>
       </w:r>
       <w:r>
         <w:rPr>
           <w:rFonts w:ascii="Arial" w:hAnsi="Arial" w:cs="Arial"/>
         </w:rPr>
-        <w:t xml:space="preserve">e </w:t>
-      </w:r>
-      <w:r>
-        <w:rPr>
-          <w:rFonts w:ascii="Arial" w:hAnsi="Arial" w:cs="Arial"/>
-        </w:rPr>
-        <w:t xml:space="preserve">1 hora e 10 minutos </w:t>
+        <w:t>24,65 e 69,98 minutos</w:t>
+      </w:r>
+      <w:r>
+        <w:rPr>
+          <w:rFonts w:ascii="Arial" w:hAnsi="Arial" w:cs="Arial"/>
+        </w:rPr>
+        <w:t xml:space="preserve"> </w:t>
       </w:r>
       <w:r>
         <w:rPr>
@@ -1333,7 +1301,25 @@
         <w:rPr>
           <w:rFonts w:ascii="Arial" w:hAnsi="Arial" w:cs="Arial"/>
         </w:rPr>
-        <w:t>115 chamadas), totalizando 2442</w:t>
+        <w:t>1</w:t>
+      </w:r>
+      <w:r>
+        <w:rPr>
+          <w:rFonts w:ascii="Arial" w:hAnsi="Arial" w:cs="Arial"/>
+        </w:rPr>
+        <w:t>38</w:t>
+      </w:r>
+      <w:r>
+        <w:rPr>
+          <w:rFonts w:ascii="Arial" w:hAnsi="Arial" w:cs="Arial"/>
+        </w:rPr>
+        <w:t xml:space="preserve"> chamadas), totalizando 2</w:t>
+      </w:r>
+      <w:r>
+        <w:rPr>
+          <w:rFonts w:ascii="Arial" w:hAnsi="Arial" w:cs="Arial"/>
+        </w:rPr>
+        <w:t>317</w:t>
       </w:r>
       <w:r>
         <w:rPr>
@@ -1358,7 +1344,6 @@
           <w:i/>
           <w:iCs/>
         </w:rPr>
-        <w:lastRenderedPageBreak/>
         <w:t>(Os recortes dos outliers e a tabela de contagem deles foram feitos com apoio de IA)</w:t>
       </w:r>
     </w:p>
@@ -1525,7 +1510,13 @@
         <w:rPr>
           <w:rFonts w:ascii="Arial" w:hAnsi="Arial" w:cs="Arial"/>
         </w:rPr>
-        <w:t xml:space="preserve"> Embora as tarifas telefônicas para redes fixas costumem ter custo por minuto inferior às redes móveis, a baixíssima taxa de adesão no telefone fixo (5,23% contra 14,74% no celular) resulta em um elevado Custo por Aquisição (CAC), devido à ociosidade e ao custo da hora do operador</w:t>
+        <w:t xml:space="preserve"> Embora as tarifas telefônicas para redes fixas costumem ter custo por minuto inferior às redes móveis, a baixíssima taxa de adesão no telefone fixo (5,23% contra 14,74% no celular) </w:t>
+      </w:r>
+      <w:r>
+        <w:rPr>
+          <w:rFonts w:ascii="Arial" w:hAnsi="Arial" w:cs="Arial"/>
+        </w:rPr>
+        <w:t>pode afetar o Custo por Aquisição (CAC), que também depende dos custos efetivos das ligações e do operador</w:t>
       </w:r>
       <w:r>
         <w:rPr>
@@ -1711,63 +1702,7 @@
         <w:rPr>
           <w:rFonts w:ascii="Arial" w:hAnsi="Arial" w:cs="Arial"/>
         </w:rPr>
-        <w:t xml:space="preserve"> em </w:t>
-      </w:r>
-      <w:proofErr w:type="gramStart"/>
-      <w:r>
-        <w:rPr>
-          <w:rFonts w:ascii="Arial" w:hAnsi="Arial" w:cs="Arial"/>
-        </w:rPr>
-        <w:t>Março</w:t>
-      </w:r>
-      <w:proofErr w:type="gramEnd"/>
-      <w:r>
-        <w:rPr>
-          <w:rFonts w:ascii="Arial" w:hAnsi="Arial" w:cs="Arial"/>
-        </w:rPr>
-        <w:t xml:space="preserve">, </w:t>
-      </w:r>
-      <w:proofErr w:type="gramStart"/>
-      <w:r>
-        <w:rPr>
-          <w:rFonts w:ascii="Arial" w:hAnsi="Arial" w:cs="Arial"/>
-        </w:rPr>
-        <w:t>Setembro</w:t>
-      </w:r>
-      <w:proofErr w:type="gramEnd"/>
-      <w:r>
-        <w:rPr>
-          <w:rFonts w:ascii="Arial" w:hAnsi="Arial" w:cs="Arial"/>
-        </w:rPr>
-        <w:t xml:space="preserve">, </w:t>
-      </w:r>
-      <w:proofErr w:type="gramStart"/>
-      <w:r>
-        <w:rPr>
-          <w:rFonts w:ascii="Arial" w:hAnsi="Arial" w:cs="Arial"/>
-        </w:rPr>
-        <w:t>Outubro</w:t>
-      </w:r>
-      <w:proofErr w:type="gramEnd"/>
-      <w:r>
-        <w:rPr>
-          <w:rFonts w:ascii="Arial" w:hAnsi="Arial" w:cs="Arial"/>
-        </w:rPr>
-        <w:t xml:space="preserve"> e </w:t>
-      </w:r>
-      <w:proofErr w:type="gramStart"/>
-      <w:r>
-        <w:rPr>
-          <w:rFonts w:ascii="Arial" w:hAnsi="Arial" w:cs="Arial"/>
-        </w:rPr>
-        <w:t>Dezembro</w:t>
-      </w:r>
-      <w:proofErr w:type="gramEnd"/>
-      <w:r>
-        <w:rPr>
-          <w:rFonts w:ascii="Arial" w:hAnsi="Arial" w:cs="Arial"/>
-        </w:rPr>
-        <w:t xml:space="preserve"> </w:t>
+        <w:t xml:space="preserve"> em Março, Setembro, Outubro e Dezembro </w:t>
       </w:r>
       <w:r>
         <w:rPr>
@@ -1794,28 +1729,7 @@
         <w:rPr>
           <w:rFonts w:ascii="Arial" w:hAnsi="Arial" w:cs="Arial"/>
         </w:rPr>
-        <w:t xml:space="preserve">durante </w:t>
-      </w:r>
-      <w:proofErr w:type="gramStart"/>
-      <w:r>
-        <w:rPr>
-          <w:rFonts w:ascii="Arial" w:hAnsi="Arial" w:cs="Arial"/>
-        </w:rPr>
-        <w:t>Maio</w:t>
-      </w:r>
-      <w:proofErr w:type="gramEnd"/>
-      <w:r>
-        <w:rPr>
-          <w:rFonts w:ascii="Arial" w:hAnsi="Arial" w:cs="Arial"/>
-        </w:rPr>
-        <w:t xml:space="preserve"> e </w:t>
-      </w:r>
-      <w:proofErr w:type="gramStart"/>
-      <w:r>
-        <w:rPr>
-          <w:rFonts w:ascii="Arial" w:hAnsi="Arial" w:cs="Arial"/>
-        </w:rPr>
-        <w:t>Ju</w:t>
+        <w:t>durante Maio e Ju</w:t>
       </w:r>
       <w:r>
         <w:rPr>
@@ -1827,14 +1741,7 @@
         <w:rPr>
           <w:rFonts w:ascii="Arial" w:hAnsi="Arial" w:cs="Arial"/>
         </w:rPr>
-        <w:t>ho</w:t>
-      </w:r>
-      <w:proofErr w:type="gramEnd"/>
-      <w:r>
-        <w:rPr>
-          <w:rFonts w:ascii="Arial" w:hAnsi="Arial" w:cs="Arial"/>
-        </w:rPr>
-        <w:t xml:space="preserve"> com taxas de sucesso inferiores a 10% </w:t>
+        <w:t xml:space="preserve">ho com taxas de sucesso inferiores a 10% </w:t>
       </w:r>
     </w:p>
     <w:p>
@@ -1850,21 +1757,7 @@
         <w:rPr>
           <w:rFonts w:ascii="Arial" w:hAnsi="Arial" w:cs="Arial"/>
         </w:rPr>
-        <w:t xml:space="preserve">Uma coisa a se notar é que o mês com maior volume de chamadas é </w:t>
-      </w:r>
-      <w:proofErr w:type="gramStart"/>
-      <w:r>
-        <w:rPr>
-          <w:rFonts w:ascii="Arial" w:hAnsi="Arial" w:cs="Arial"/>
-        </w:rPr>
-        <w:t>Maio</w:t>
-      </w:r>
-      <w:proofErr w:type="gramEnd"/>
-      <w:r>
-        <w:rPr>
-          <w:rFonts w:ascii="Arial" w:hAnsi="Arial" w:cs="Arial"/>
-        </w:rPr>
-        <w:t>,</w:t>
+        <w:t>Uma coisa a se notar é que o mês com maior volume de chamadas é Maio,</w:t>
       </w:r>
       <w:r>
         <w:rPr>
@@ -1924,7 +1817,7 @@
       </w:r>
       <w:r>
         <w:pict w14:anchorId="11265BC4">
-          <v:rect id="_x0000_i1069" style="width:0;height:1.5pt" o:hralign="center" o:hrstd="t" o:hr="t" fillcolor="gray" stroked="f"/>
+          <v:rect id="_x0000_i1027" style="width:0;height:1.5pt" o:hralign="center" o:hrstd="t" o:hr="t" fillcolor="gray" stroked="f"/>
         </w:pict>
       </w:r>
     </w:p>
@@ -1966,21 +1859,7 @@
         <w:rPr>
           <w:rFonts w:ascii="Arial" w:hAnsi="Arial" w:cs="Arial"/>
         </w:rPr>
-        <w:t>dias_desde_</w:t>
-      </w:r>
-      <w:proofErr w:type="gramStart"/>
-      <w:r>
-        <w:rPr>
-          <w:rFonts w:ascii="Arial" w:hAnsi="Arial" w:cs="Arial"/>
-        </w:rPr>
-        <w:t>ultimo</w:t>
-      </w:r>
-      <w:proofErr w:type="gramEnd"/>
-      <w:r>
-        <w:rPr>
-          <w:rFonts w:ascii="Arial" w:hAnsi="Arial" w:cs="Arial"/>
-        </w:rPr>
-        <w:t>_contato</w:t>
+        <w:t>dias_desde_ultimo_contato</w:t>
       </w:r>
       <w:proofErr w:type="spellEnd"/>
       <w:r>
@@ -2191,7 +2070,7 @@
         <w:rPr>
           <w:rFonts w:ascii="Arial" w:hAnsi="Arial" w:cs="Arial"/>
         </w:rPr>
-        <w:t xml:space="preserve">PS: essa base não tinha valores nulos para que o </w:t>
+        <w:t xml:space="preserve">PS: essa base não tinha valores nulos, mas o </w:t>
       </w:r>
       <w:proofErr w:type="spellStart"/>
       <w:r>
@@ -2205,7 +2084,21 @@
         <w:rPr>
           <w:rFonts w:ascii="Arial" w:hAnsi="Arial" w:cs="Arial"/>
         </w:rPr>
-        <w:t xml:space="preserve"> tivesse algum efeito real, mas, eu resolvi colocar só por padronização mesmo.</w:t>
+        <w:t xml:space="preserve"> teve efeito real ao padronizar as variáveis numéricas; o </w:t>
+      </w:r>
+      <w:proofErr w:type="spellStart"/>
+      <w:r>
+        <w:rPr>
+          <w:rFonts w:ascii="Arial" w:hAnsi="Arial" w:cs="Arial"/>
+        </w:rPr>
+        <w:t>SimpleImputer</w:t>
+      </w:r>
+      <w:proofErr w:type="spellEnd"/>
+      <w:r>
+        <w:rPr>
+          <w:rFonts w:ascii="Arial" w:hAnsi="Arial" w:cs="Arial"/>
+        </w:rPr>
+        <w:t xml:space="preserve"> foi mantido por precaução.</w:t>
       </w:r>
     </w:p>
     <w:p>
@@ -2272,7 +2165,7 @@
       </w:r>
       <w:r>
         <w:pict w14:anchorId="38C7678C">
-          <v:rect id="_x0000_i1070" style="width:0;height:1.5pt" o:hralign="center" o:hrstd="t" o:hr="t" fillcolor="gray" stroked="f"/>
+          <v:rect id="_x0000_i1028" style="width:0;height:1.5pt" o:hralign="center" o:hrstd="t" o:hr="t" fillcolor="gray" stroked="f"/>
         </w:pict>
       </w:r>
     </w:p>
@@ -2315,19 +2208,31 @@
         <w:rPr>
           <w:rFonts w:ascii="Arial" w:hAnsi="Arial" w:cs="Arial"/>
         </w:rPr>
-        <w:t>a busca foi realizada sobre uma amostra estratificada da base para reduzir o custo computacional elevado dos modelos</w:t>
-      </w:r>
-      <w:r>
-        <w:rPr>
-          <w:rFonts w:ascii="Arial" w:hAnsi="Arial" w:cs="Arial"/>
-        </w:rPr>
-        <w:t>, o treino final, porém, foi feito sobre o conjunto de teste complet</w:t>
-      </w:r>
-      <w:r>
-        <w:rPr>
-          <w:rFonts w:ascii="Arial" w:hAnsi="Arial" w:cs="Arial"/>
-        </w:rPr>
-        <w:t>o.</w:t>
+        <w:t>a busca do k-NN foi realizada sobre uma amostra estratificada do conjunto de treino</w:t>
+      </w:r>
+      <w:r>
+        <w:rPr>
+          <w:rFonts w:ascii="Arial" w:hAnsi="Arial" w:cs="Arial"/>
+        </w:rPr>
+        <w:t xml:space="preserve"> para reduzir o custo computacional elevado dos modelos</w:t>
+      </w:r>
+      <w:r>
+        <w:rPr>
+          <w:rFonts w:ascii="Arial" w:hAnsi="Arial" w:cs="Arial"/>
+        </w:rPr>
+        <w:t xml:space="preserve">, </w:t>
+      </w:r>
+      <w:r>
+        <w:rPr>
+          <w:rFonts w:ascii="Arial" w:hAnsi="Arial" w:cs="Arial"/>
+        </w:rPr>
+        <w:t>o treino final, porém, foi feito sobre o conjunto de treino completo</w:t>
+      </w:r>
+      <w:r>
+        <w:rPr>
+          <w:rFonts w:ascii="Arial" w:hAnsi="Arial" w:cs="Arial"/>
+        </w:rPr>
+        <w:t>.</w:t>
       </w:r>
     </w:p>
     <w:p>
@@ -2345,18 +2250,26 @@
           <w:noProof/>
         </w:rPr>
         <w:drawing>
-          <wp:anchor distT="0" distB="0" distL="114300" distR="114300" simplePos="0" relativeHeight="251658245" behindDoc="0" locked="0" layoutInCell="1" allowOverlap="1" wp14:anchorId="67EE5C09" wp14:editId="7FD60920">
+          <wp:anchor distT="0" distB="0" distL="114300" distR="114300" simplePos="0" relativeHeight="251660294" behindDoc="1" locked="0" layoutInCell="1" allowOverlap="1" wp14:anchorId="1B74D006" wp14:editId="180E55DA">
             <wp:simplePos x="0" y="0"/>
             <wp:positionH relativeFrom="margin">
-              <wp:posOffset>2719705</wp:posOffset>
+              <wp:align>right</wp:align>
             </wp:positionH>
-            <wp:positionV relativeFrom="margin">
-              <wp:posOffset>6064250</wp:posOffset>
+            <wp:positionV relativeFrom="paragraph">
+              <wp:posOffset>85725</wp:posOffset>
             </wp:positionV>
-            <wp:extent cx="2654300" cy="2325370"/>
-            <wp:effectExtent l="0" t="0" r="0" b="0"/>
-            <wp:wrapSquare wrapText="bothSides"/>
-            <wp:docPr id="7" name="Imagem 7"/>
+            <wp:extent cx="2565400" cy="2240280"/>
+            <wp:effectExtent l="0" t="0" r="6350" b="7620"/>
+            <wp:wrapTight wrapText="bothSides">
+              <wp:wrapPolygon edited="0">
+                <wp:start x="0" y="0"/>
+                <wp:lineTo x="0" y="21490"/>
+                <wp:lineTo x="21493" y="21490"/>
+                <wp:lineTo x="21493" y="0"/>
+                <wp:lineTo x="0" y="0"/>
+              </wp:wrapPolygon>
+            </wp:wrapTight>
+            <wp:docPr id="1655970668" name="Imagem 1"/>
             <wp:cNvGraphicFramePr>
               <a:graphicFrameLocks xmlns:a="http://schemas.openxmlformats.org/drawingml/2006/main" noChangeAspect="1"/>
             </wp:cNvGraphicFramePr>
@@ -2364,7 +2277,7 @@
               <a:graphicData uri="http://schemas.openxmlformats.org/drawingml/2006/picture">
                 <pic:pic xmlns:pic="http://schemas.openxmlformats.org/drawingml/2006/picture">
                   <pic:nvPicPr>
-                    <pic:cNvPr id="1" name=""/>
+                    <pic:cNvPr id="1655970668" name=""/>
                     <pic:cNvPicPr/>
                   </pic:nvPicPr>
                   <pic:blipFill>
@@ -2382,7 +2295,7 @@
                   <pic:spPr>
                     <a:xfrm>
                       <a:off x="0" y="0"/>
-                      <a:ext cx="2654300" cy="2325370"/>
+                      <a:ext cx="2565400" cy="2240280"/>
                     </a:xfrm>
                     <a:prstGeom prst="rect">
                       <a:avLst/>
@@ -2391,6 +2304,12 @@
                 </pic:pic>
               </a:graphicData>
             </a:graphic>
+            <wp14:sizeRelH relativeFrom="margin">
+              <wp14:pctWidth>0</wp14:pctWidth>
+            </wp14:sizeRelH>
+            <wp14:sizeRelV relativeFrom="margin">
+              <wp14:pctHeight>0</wp14:pctHeight>
+            </wp14:sizeRelV>
           </wp:anchor>
         </w:drawing>
       </w:r>
@@ -2398,7 +2317,19 @@
         <w:rPr>
           <w:rFonts w:ascii="Arial" w:hAnsi="Arial" w:cs="Arial"/>
         </w:rPr>
-        <w:t>No k-NN, testamos 3, 5, 7, 9, 11, 15 e 21 vizinhos, com pesos iguais ou ponderados pela distância. Para reduzir o tempo da busca, visto que a quantidade total de operações para classificar uma nova entrada é de aproximadamente 1,74 milhões, usamos uma amostra estratificada de 30% do conjunto de treino. A melhor combinação foi k=21 com pesos iguais</w:t>
+        <w:t>No k-NN, testamos 3, 5, 7, 9, 11, 15 e 21 vizinhos, com pesos iguais ou ponderados pela distância. Para reduzir o tempo da busca, visto que a quantidade total de operações para classificar uma nova entrada é de aproximadamente 1,</w:t>
+      </w:r>
+      <w:r>
+        <w:rPr>
+          <w:rFonts w:ascii="Arial" w:hAnsi="Arial" w:cs="Arial"/>
+        </w:rPr>
+        <w:t>53</w:t>
+      </w:r>
+      <w:r>
+        <w:rPr>
+          <w:rFonts w:ascii="Arial" w:hAnsi="Arial" w:cs="Arial"/>
+        </w:rPr>
+        <w:t xml:space="preserve"> milhões, usamos uma amostra estratificada de 30% do conjunto de treino. A melhor combinação foi k=21 com pesos iguais</w:t>
       </w:r>
       <w:r>
         <w:rPr>
@@ -2422,28 +2353,40 @@
         <w:rPr>
           <w:rFonts w:ascii="Arial" w:hAnsi="Arial" w:cs="Arial"/>
         </w:rPr>
-        <w:t>O critério de seleção foi a métrica ROC-AUC, mais adequada ao desbalanceamento da classe</w:t>
-      </w:r>
-      <w:r>
-        <w:rPr>
-          <w:rFonts w:ascii="Arial" w:hAnsi="Arial" w:cs="Arial"/>
+        <w:t xml:space="preserve">O critério de seleção foi a métrica ROC-AUC, </w:t>
+      </w:r>
+      <w:r>
+        <w:rPr>
+          <w:rFonts w:ascii="Arial" w:hAnsi="Arial" w:cs="Arial"/>
+        </w:rPr>
+        <w:t xml:space="preserve">usada para escolher os </w:t>
+      </w:r>
+      <w:proofErr w:type="spellStart"/>
+      <w:r>
+        <w:rPr>
+          <w:rFonts w:ascii="Arial" w:hAnsi="Arial" w:cs="Arial"/>
+        </w:rPr>
+        <w:t>hiperparâmetros</w:t>
+      </w:r>
+      <w:proofErr w:type="spellEnd"/>
+      <w:r>
+        <w:rPr>
+          <w:rFonts w:ascii="Arial" w:hAnsi="Arial" w:cs="Arial"/>
+        </w:rPr>
+        <w:t xml:space="preserve"> sem depender do limiar de classificação; a comparação final prioriza o recall da classe “sim”</w:t>
+      </w:r>
+      <w:r>
+        <w:rPr>
+          <w:rFonts w:ascii="Arial" w:hAnsi="Arial" w:cs="Arial"/>
+        </w:rPr>
+        <w:t>.</w:t>
+      </w:r>
+      <w:r>
+        <w:rPr>
+          <w:noProof/>
         </w:rPr>
         <w:t xml:space="preserve"> </w:t>
       </w:r>
-      <w:r>
-        <w:rPr>
-          <w:rFonts w:ascii="Arial" w:hAnsi="Arial" w:cs="Arial"/>
-          <w:i/>
-          <w:iCs/>
-        </w:rPr>
-        <w:t>aderiu</w:t>
-      </w:r>
-      <w:r>
-        <w:rPr>
-          <w:rFonts w:ascii="Arial" w:hAnsi="Arial" w:cs="Arial"/>
-        </w:rPr>
-        <w:t>.</w:t>
-      </w:r>
     </w:p>
     <w:p>
       <w:pPr>
@@ -2467,7 +2410,6 @@
         <w:rPr>
           <w:rFonts w:ascii="Arial" w:hAnsi="Arial" w:cs="Arial"/>
         </w:rPr>
-        <w:lastRenderedPageBreak/>
         <w:t xml:space="preserve">Aqui comparamos as variantes </w:t>
       </w:r>
       <w:proofErr w:type="spellStart"/>
@@ -2513,10 +2455,10 @@
           <w:noProof/>
         </w:rPr>
         <w:drawing>
-          <wp:inline distT="0" distB="0" distL="0" distR="0" wp14:anchorId="52B8345C" wp14:editId="3C4AF11F">
-            <wp:extent cx="4826000" cy="2070799"/>
-            <wp:effectExtent l="0" t="0" r="0" b="5715"/>
-            <wp:docPr id="10" name="Imagem 10"/>
+          <wp:inline distT="0" distB="0" distL="0" distR="0" wp14:anchorId="2D5105F3" wp14:editId="79E336DC">
+            <wp:extent cx="5323840" cy="2313940"/>
+            <wp:effectExtent l="0" t="0" r="0" b="0"/>
+            <wp:docPr id="1948997403" name="Imagem 1"/>
             <wp:cNvGraphicFramePr>
               <a:graphicFrameLocks xmlns:a="http://schemas.openxmlformats.org/drawingml/2006/main" noChangeAspect="1"/>
             </wp:cNvGraphicFramePr>
@@ -2524,23 +2466,32 @@
               <a:graphicData uri="http://schemas.openxmlformats.org/drawingml/2006/picture">
                 <pic:pic xmlns:pic="http://schemas.openxmlformats.org/drawingml/2006/picture">
                   <pic:nvPicPr>
-                    <pic:cNvPr id="1" name=""/>
+                    <pic:cNvPr id="1948997403" name=""/>
                     <pic:cNvPicPr/>
                   </pic:nvPicPr>
-                  <pic:blipFill>
+                  <pic:blipFill rotWithShape="1">
                     <a:blip r:embed="rId12"/>
+                    <a:srcRect l="852" r="-1"/>
                     <a:stretch>
                       <a:fillRect/>
                     </a:stretch>
                   </pic:blipFill>
-                  <pic:spPr>
+                  <pic:spPr bwMode="auto">
                     <a:xfrm>
                       <a:off x="0" y="0"/>
-                      <a:ext cx="4831689" cy="2073240"/>
+                      <a:ext cx="5323840" cy="2313940"/>
                     </a:xfrm>
                     <a:prstGeom prst="rect">
                       <a:avLst/>
                     </a:prstGeom>
+                    <a:ln>
+                      <a:noFill/>
+                    </a:ln>
+                    <a:extLst>
+                      <a:ext uri="{53640926-AAD7-44D8-BBD7-CCE9431645EC}">
+                        <a14:shadowObscured xmlns:a14="http://schemas.microsoft.com/office/drawing/2010/main"/>
+                      </a:ext>
+                    </a:extLst>
                   </pic:spPr>
                 </pic:pic>
               </a:graphicData>
@@ -2657,21 +2608,183 @@
       <w:r>
         <w:rPr>
           <w:rFonts w:ascii="Arial" w:hAnsi="Arial" w:cs="Arial"/>
+        </w:rPr>
+        <w:t xml:space="preserve">Os testes nos mostraram que o modelo com </w:t>
+      </w:r>
+      <w:proofErr w:type="spellStart"/>
+      <w:r>
+        <w:rPr>
+          <w:rFonts w:ascii="Arial" w:hAnsi="Arial" w:cs="Arial"/>
+        </w:rPr>
+        <w:t>GaussianNB</w:t>
+      </w:r>
+      <w:proofErr w:type="spellEnd"/>
+      <w:r>
+        <w:rPr>
+          <w:rFonts w:ascii="Arial" w:hAnsi="Arial" w:cs="Arial"/>
+        </w:rPr>
+        <w:t xml:space="preserve"> teve 51,</w:t>
+      </w:r>
+      <w:r>
+        <w:rPr>
+          <w:rFonts w:ascii="Arial" w:hAnsi="Arial" w:cs="Arial"/>
+        </w:rPr>
+        <w:t>72</w:t>
+      </w:r>
+      <w:r>
+        <w:rPr>
+          <w:rFonts w:ascii="Arial" w:hAnsi="Arial" w:cs="Arial"/>
+        </w:rPr>
+        <w:t xml:space="preserve">% de recall, </w:t>
+      </w:r>
+      <w:r>
+        <w:rPr>
+          <w:rFonts w:ascii="Arial" w:hAnsi="Arial" w:cs="Arial"/>
+        </w:rPr>
+        <w:t xml:space="preserve">enquanto o </w:t>
+      </w:r>
+      <w:proofErr w:type="spellStart"/>
+      <w:r>
+        <w:rPr>
+          <w:rFonts w:ascii="Arial" w:hAnsi="Arial" w:cs="Arial"/>
+        </w:rPr>
+        <w:t>BernoulliNB</w:t>
+      </w:r>
+      <w:proofErr w:type="spellEnd"/>
+      <w:r>
+        <w:rPr>
+          <w:rFonts w:ascii="Arial" w:hAnsi="Arial" w:cs="Arial"/>
+        </w:rPr>
+        <w:t xml:space="preserve"> teve 5</w:t>
+      </w:r>
+      <w:r>
+        <w:rPr>
+          <w:rFonts w:ascii="Arial" w:hAnsi="Arial" w:cs="Arial"/>
+        </w:rPr>
+        <w:t>6</w:t>
+      </w:r>
+      <w:r>
+        <w:rPr>
+          <w:rFonts w:ascii="Arial" w:hAnsi="Arial" w:cs="Arial"/>
+        </w:rPr>
+        <w:t>,11%</w:t>
+      </w:r>
+      <w:r>
+        <w:rPr>
+          <w:rFonts w:ascii="Arial" w:hAnsi="Arial" w:cs="Arial"/>
+        </w:rPr>
+        <w:t xml:space="preserve">, capturando </w:t>
+      </w:r>
+      <w:r>
+        <w:rPr>
+          <w:rFonts w:ascii="Arial" w:hAnsi="Arial" w:cs="Arial"/>
+        </w:rPr>
+        <w:t>781 dos 1.392 clientes</w:t>
+      </w:r>
+      <w:r>
+        <w:rPr>
+          <w:rFonts w:ascii="Arial" w:hAnsi="Arial" w:cs="Arial"/>
+        </w:rPr>
+        <w:t xml:space="preserve"> </w:t>
+      </w:r>
+      <w:r>
+        <w:rPr>
+          <w:rFonts w:ascii="Arial" w:hAnsi="Arial" w:cs="Arial"/>
+        </w:rPr>
+        <w:t>que aderiram</w:t>
+      </w:r>
+      <w:r>
+        <w:rPr>
+          <w:rFonts w:ascii="Arial" w:hAnsi="Arial" w:cs="Arial"/>
+        </w:rPr>
+        <w:t xml:space="preserve">. O trade-off, porém, é algo a se considerar, </w:t>
+      </w:r>
+      <w:r>
+        <w:rPr>
+          <w:rFonts w:ascii="Arial" w:hAnsi="Arial" w:cs="Arial"/>
+        </w:rPr>
+        <w:t xml:space="preserve">o </w:t>
+      </w:r>
+      <w:proofErr w:type="spellStart"/>
+      <w:r>
+        <w:rPr>
+          <w:rFonts w:ascii="Arial" w:hAnsi="Arial" w:cs="Arial"/>
+        </w:rPr>
+        <w:t>BernoulliNB</w:t>
+      </w:r>
+      <w:proofErr w:type="spellEnd"/>
+      <w:r>
+        <w:rPr>
+          <w:rFonts w:ascii="Arial" w:hAnsi="Arial" w:cs="Arial"/>
+        </w:rPr>
+        <w:t xml:space="preserve"> apresentou 34,</w:t>
+      </w:r>
+      <w:r>
+        <w:rPr>
+          <w:rFonts w:ascii="Arial" w:hAnsi="Arial" w:cs="Arial"/>
+        </w:rPr>
+        <w:t>05</w:t>
+      </w:r>
+      <w:r>
+        <w:rPr>
+          <w:rFonts w:ascii="Arial" w:hAnsi="Arial" w:cs="Arial"/>
+        </w:rPr>
+        <w:t>% de precisão apenas, com 1</w:t>
+      </w:r>
+      <w:r>
+        <w:rPr>
+          <w:rFonts w:ascii="Arial" w:hAnsi="Arial" w:cs="Arial"/>
+        </w:rPr>
+        <w:t>513</w:t>
+      </w:r>
+      <w:r>
+        <w:rPr>
+          <w:rFonts w:ascii="Arial" w:hAnsi="Arial" w:cs="Arial"/>
+        </w:rPr>
+        <w:t xml:space="preserve"> falsos positivos</w:t>
+      </w:r>
+      <w:r>
+        <w:rPr>
+          <w:rFonts w:ascii="Arial" w:hAnsi="Arial" w:cs="Arial"/>
+        </w:rPr>
+        <w:t>.</w:t>
+      </w:r>
+    </w:p>
+    <w:p>
+      <w:pPr>
+        <w:spacing w:before="240" w:line="240" w:lineRule="auto"/>
+        <w:ind w:firstLine="360"/>
+        <w:jc w:val="both"/>
+        <w:rPr>
+          <w:rFonts w:ascii="Arial" w:hAnsi="Arial" w:cs="Arial"/>
+        </w:rPr>
+      </w:pPr>
+      <w:r>
+        <w:rPr>
+          <w:rFonts w:ascii="Arial" w:hAnsi="Arial" w:cs="Arial"/>
           <w:noProof/>
         </w:rPr>
         <w:drawing>
-          <wp:anchor distT="0" distB="0" distL="114300" distR="114300" simplePos="0" relativeHeight="251658246" behindDoc="0" locked="0" layoutInCell="1" allowOverlap="1" wp14:anchorId="5A365E31" wp14:editId="0524F016">
+          <wp:anchor distT="0" distB="0" distL="114300" distR="114300" simplePos="0" relativeHeight="251659270" behindDoc="1" locked="0" layoutInCell="1" allowOverlap="1" wp14:anchorId="5A705643" wp14:editId="2229A69C">
             <wp:simplePos x="0" y="0"/>
-            <wp:positionH relativeFrom="margin">
-              <wp:posOffset>-635</wp:posOffset>
+            <wp:positionH relativeFrom="column">
+              <wp:posOffset>47625</wp:posOffset>
             </wp:positionH>
-            <wp:positionV relativeFrom="page">
-              <wp:posOffset>5591810</wp:posOffset>
+            <wp:positionV relativeFrom="paragraph">
+              <wp:posOffset>58420</wp:posOffset>
             </wp:positionV>
-            <wp:extent cx="2768600" cy="2450465"/>
-            <wp:effectExtent l="0" t="0" r="0" b="6985"/>
-            <wp:wrapSquare wrapText="bothSides"/>
-            <wp:docPr id="12" name="Imagem 12"/>
+            <wp:extent cx="2270760" cy="2014220"/>
+            <wp:effectExtent l="0" t="0" r="0" b="5080"/>
+            <wp:wrapTight wrapText="bothSides">
+              <wp:wrapPolygon edited="0">
+                <wp:start x="0" y="0"/>
+                <wp:lineTo x="0" y="21450"/>
+                <wp:lineTo x="21383" y="21450"/>
+                <wp:lineTo x="21383" y="0"/>
+                <wp:lineTo x="0" y="0"/>
+              </wp:wrapPolygon>
+            </wp:wrapTight>
+            <wp:docPr id="2141588991" name="Imagem 1"/>
             <wp:cNvGraphicFramePr>
               <a:graphicFrameLocks xmlns:a="http://schemas.openxmlformats.org/drawingml/2006/main" noChangeAspect="1"/>
             </wp:cNvGraphicFramePr>
@@ -2679,11 +2792,11 @@
               <a:graphicData uri="http://schemas.openxmlformats.org/drawingml/2006/picture">
                 <pic:pic xmlns:pic="http://schemas.openxmlformats.org/drawingml/2006/picture">
                   <pic:nvPicPr>
-                    <pic:cNvPr id="1" name=""/>
+                    <pic:cNvPr id="2141588991" name=""/>
                     <pic:cNvPicPr/>
                   </pic:nvPicPr>
                   <pic:blipFill>
-                    <a:blip r:embed="rId13">
+                    <a:blip r:embed="rId13" cstate="print">
                       <a:extLst>
                         <a:ext uri="{28A0092B-C50C-407E-A947-70E740481C1C}">
                           <a14:useLocalDpi xmlns:a14="http://schemas.microsoft.com/office/drawing/2010/main" val="0"/>
@@ -2697,7 +2810,7 @@
                   <pic:spPr>
                     <a:xfrm>
                       <a:off x="0" y="0"/>
-                      <a:ext cx="2768600" cy="2450465"/>
+                      <a:ext cx="2270760" cy="2014220"/>
                     </a:xfrm>
                     <a:prstGeom prst="rect">
                       <a:avLst/>
@@ -2706,6 +2819,12 @@
                 </pic:pic>
               </a:graphicData>
             </a:graphic>
+            <wp14:sizeRelH relativeFrom="margin">
+              <wp14:pctWidth>0</wp14:pctWidth>
+            </wp14:sizeRelH>
+            <wp14:sizeRelV relativeFrom="margin">
+              <wp14:pctHeight>0</wp14:pctHeight>
+            </wp14:sizeRelV>
           </wp:anchor>
         </w:drawing>
       </w:r>
@@ -2713,258 +2832,171 @@
         <w:rPr>
           <w:rFonts w:ascii="Arial" w:hAnsi="Arial" w:cs="Arial"/>
         </w:rPr>
-        <w:t xml:space="preserve">Os testes nos mostraram que o modelo com </w:t>
+        <w:t>Em seguida, a</w:t>
+      </w:r>
+      <w:r>
+        <w:rPr>
+          <w:rFonts w:ascii="Arial" w:hAnsi="Arial" w:cs="Arial"/>
+        </w:rPr>
+        <w:t xml:space="preserve"> regressão logística se portou de forma extremamente conservadora</w:t>
+      </w:r>
+      <w:r>
+        <w:rPr>
+          <w:rFonts w:ascii="Arial" w:hAnsi="Arial" w:cs="Arial"/>
+        </w:rPr>
+        <w:t xml:space="preserve">, quando um cliente vai aderir, a chance do modelo estar correta é alta </w:t>
+      </w:r>
+      <w:r>
+        <w:rPr>
+          <w:rFonts w:ascii="Arial" w:hAnsi="Arial" w:cs="Arial"/>
+        </w:rPr>
+        <w:t xml:space="preserve">em </w:t>
+      </w:r>
+      <w:r>
+        <w:rPr>
+          <w:rFonts w:ascii="Arial" w:hAnsi="Arial" w:cs="Arial"/>
+        </w:rPr>
+        <w:t>67</w:t>
+      </w:r>
+      <w:r>
+        <w:rPr>
+          <w:rFonts w:ascii="Arial" w:hAnsi="Arial" w:cs="Arial"/>
+        </w:rPr>
+        <w:t>,12</w:t>
+      </w:r>
+      <w:r>
+        <w:rPr>
+          <w:rFonts w:ascii="Arial" w:hAnsi="Arial" w:cs="Arial"/>
+        </w:rPr>
+        <w:t>%</w:t>
+      </w:r>
+      <w:r>
+        <w:rPr>
+          <w:rFonts w:ascii="Arial" w:hAnsi="Arial" w:cs="Arial"/>
+        </w:rPr>
+        <w:t xml:space="preserve"> de precisão (</w:t>
+      </w:r>
+      <w:r>
+        <w:rPr>
+          <w:rFonts w:ascii="Arial" w:hAnsi="Arial" w:cs="Arial"/>
+        </w:rPr>
+        <w:t>294</w:t>
+      </w:r>
+      <w:r>
+        <w:rPr>
+          <w:rFonts w:ascii="Arial" w:hAnsi="Arial" w:cs="Arial"/>
+        </w:rPr>
+        <w:t xml:space="preserve"> dos </w:t>
+      </w:r>
+      <w:r>
+        <w:rPr>
+          <w:rFonts w:ascii="Arial" w:hAnsi="Arial" w:cs="Arial"/>
+        </w:rPr>
+        <w:t>438</w:t>
+      </w:r>
+      <w:r>
+        <w:rPr>
+          <w:rFonts w:ascii="Arial" w:hAnsi="Arial" w:cs="Arial"/>
+        </w:rPr>
+        <w:t>)</w:t>
+      </w:r>
+      <w:r>
+        <w:rPr>
+          <w:rFonts w:ascii="Arial" w:hAnsi="Arial" w:cs="Arial"/>
+        </w:rPr>
+        <w:t>, no entanto, devido ao alto desbalanceamento da classe de interesse, a probabilidade calculada raramente passa do limiar padrão de 0,5</w:t>
+      </w:r>
+      <w:r>
+        <w:rPr>
+          <w:rFonts w:ascii="Arial" w:hAnsi="Arial" w:cs="Arial"/>
+        </w:rPr>
+        <w:t xml:space="preserve">, o modelo falha em capturar </w:t>
+      </w:r>
+      <w:r>
+        <w:rPr>
+          <w:rFonts w:ascii="Arial" w:hAnsi="Arial" w:cs="Arial"/>
+        </w:rPr>
+        <w:t>1.098 dos 1.392 clientes potenciais</w:t>
+      </w:r>
+      <w:r>
+        <w:rPr>
+          <w:rFonts w:ascii="Arial" w:hAnsi="Arial" w:cs="Arial"/>
+        </w:rPr>
+        <w:t>, apresentando um recall de apenas 21,12%</w:t>
+      </w:r>
+      <w:r>
+        <w:rPr>
+          <w:rFonts w:ascii="Arial" w:hAnsi="Arial" w:cs="Arial"/>
+        </w:rPr>
+        <w:t xml:space="preserve">. </w:t>
+      </w:r>
+    </w:p>
+    <w:p>
+      <w:pPr>
+        <w:spacing w:before="240" w:line="240" w:lineRule="auto"/>
+        <w:ind w:firstLine="360"/>
+        <w:jc w:val="both"/>
+        <w:rPr>
+          <w:rFonts w:ascii="Arial" w:hAnsi="Arial" w:cs="Arial"/>
+        </w:rPr>
+      </w:pPr>
+      <w:r>
+        <w:rPr>
+          <w:rFonts w:ascii="Arial" w:hAnsi="Arial" w:cs="Arial"/>
+        </w:rPr>
+        <w:t>Para utilizar a Regressão Logística em ambiente de produção mantendo o foco em maximizar adesões, é indispensável reajustar o limiar decisório</w:t>
+      </w:r>
+      <w:r>
+        <w:rPr>
+          <w:rFonts w:ascii="Arial" w:hAnsi="Arial" w:cs="Arial"/>
+        </w:rPr>
+        <w:t>. Aqui essa ação não foi realizada pois estamos visando a comparação padronizada entre os modelos</w:t>
+      </w:r>
+      <w:r>
+        <w:rPr>
+          <w:rFonts w:ascii="Arial" w:hAnsi="Arial" w:cs="Arial"/>
+        </w:rPr>
+        <w:t xml:space="preserve">, então foi assumido o limiar padrão de 0,5 do </w:t>
       </w:r>
       <w:proofErr w:type="spellStart"/>
       <w:r>
         <w:rPr>
           <w:rFonts w:ascii="Arial" w:hAnsi="Arial" w:cs="Arial"/>
         </w:rPr>
-        <w:t>GaussianNB</w:t>
+        <w:t>s</w:t>
+      </w:r>
+      <w:r>
+        <w:rPr>
+          <w:rFonts w:ascii="Arial" w:hAnsi="Arial" w:cs="Arial"/>
+        </w:rPr>
+        <w:t>cikit-learn</w:t>
       </w:r>
       <w:proofErr w:type="spellEnd"/>
       <w:r>
         <w:rPr>
           <w:rFonts w:ascii="Arial" w:hAnsi="Arial" w:cs="Arial"/>
         </w:rPr>
-        <w:t xml:space="preserve"> teve 51,08% de recall, </w:t>
-      </w:r>
-      <w:r>
-        <w:rPr>
-          <w:rFonts w:ascii="Arial" w:hAnsi="Arial" w:cs="Arial"/>
-        </w:rPr>
-        <w:t xml:space="preserve">enquanto o </w:t>
-      </w:r>
-      <w:proofErr w:type="spellStart"/>
-      <w:r>
-        <w:rPr>
-          <w:rFonts w:ascii="Arial" w:hAnsi="Arial" w:cs="Arial"/>
-        </w:rPr>
-        <w:t>BernoulliNB</w:t>
-      </w:r>
-      <w:proofErr w:type="spellEnd"/>
-      <w:r>
-        <w:rPr>
-          <w:rFonts w:ascii="Arial" w:hAnsi="Arial" w:cs="Arial"/>
-        </w:rPr>
-        <w:t xml:space="preserve"> teve 57,11%</w:t>
-      </w:r>
-      <w:r>
-        <w:rPr>
-          <w:rFonts w:ascii="Arial" w:hAnsi="Arial" w:cs="Arial"/>
-        </w:rPr>
-        <w:t>, capturando 530 dos 928 clientes que aderiram</w:t>
-      </w:r>
-      <w:r>
-        <w:rPr>
-          <w:rFonts w:ascii="Arial" w:hAnsi="Arial" w:cs="Arial"/>
-        </w:rPr>
-        <w:t xml:space="preserve">. O trade-off, porém, é algo a se considerar, </w:t>
-      </w:r>
-      <w:r>
-        <w:rPr>
-          <w:rFonts w:ascii="Arial" w:hAnsi="Arial" w:cs="Arial"/>
-        </w:rPr>
-        <w:t xml:space="preserve">o </w:t>
-      </w:r>
-      <w:proofErr w:type="spellStart"/>
-      <w:r>
-        <w:rPr>
-          <w:rFonts w:ascii="Arial" w:hAnsi="Arial" w:cs="Arial"/>
-        </w:rPr>
-        <w:t>BernoulliNB</w:t>
-      </w:r>
-      <w:proofErr w:type="spellEnd"/>
-      <w:r>
-        <w:rPr>
-          <w:rFonts w:ascii="Arial" w:hAnsi="Arial" w:cs="Arial"/>
-        </w:rPr>
-        <w:t xml:space="preserve"> apresentou 34,22% de precisão apenas, com 1019 falsos positivos</w:t>
-      </w:r>
-      <w:r>
-        <w:rPr>
-          <w:rFonts w:ascii="Arial" w:hAnsi="Arial" w:cs="Arial"/>
-        </w:rPr>
         <w:t>.</w:t>
       </w:r>
     </w:p>
     <w:p>
       <w:pPr>
         <w:spacing w:before="240" w:line="240" w:lineRule="auto"/>
-        <w:ind w:firstLine="360"/>
-        <w:jc w:val="both"/>
-        <w:rPr>
-          <w:rFonts w:ascii="Arial" w:hAnsi="Arial" w:cs="Arial"/>
-        </w:rPr>
-      </w:pPr>
-      <w:r>
-        <w:rPr>
-          <w:rFonts w:ascii="Arial" w:hAnsi="Arial" w:cs="Arial"/>
-        </w:rPr>
-        <w:t>Em seguida, a</w:t>
-      </w:r>
-      <w:r>
-        <w:rPr>
-          <w:rFonts w:ascii="Arial" w:hAnsi="Arial" w:cs="Arial"/>
-        </w:rPr>
-        <w:t xml:space="preserve"> regressão logística se portou de forma extremamente conservadora</w:t>
-      </w:r>
-      <w:r>
-        <w:rPr>
-          <w:rFonts w:ascii="Arial" w:hAnsi="Arial" w:cs="Arial"/>
-        </w:rPr>
-        <w:t xml:space="preserve">, quando um cliente vai aderir, a chance </w:t>
-      </w:r>
-      <w:proofErr w:type="gramStart"/>
-      <w:r>
-        <w:rPr>
-          <w:rFonts w:ascii="Arial" w:hAnsi="Arial" w:cs="Arial"/>
-        </w:rPr>
-        <w:t>do</w:t>
-      </w:r>
-      <w:proofErr w:type="gramEnd"/>
-      <w:r>
-        <w:rPr>
-          <w:rFonts w:ascii="Arial" w:hAnsi="Arial" w:cs="Arial"/>
-        </w:rPr>
-        <w:t xml:space="preserve"> modelo estar correta é alta </w:t>
-      </w:r>
-      <w:r>
-        <w:rPr>
-          <w:rFonts w:ascii="Arial" w:hAnsi="Arial" w:cs="Arial"/>
-        </w:rPr>
-        <w:t xml:space="preserve">em </w:t>
-      </w:r>
-      <w:r>
-        <w:rPr>
-          <w:rFonts w:ascii="Arial" w:hAnsi="Arial" w:cs="Arial"/>
-        </w:rPr>
-        <w:t>66,67%</w:t>
-      </w:r>
-      <w:r>
-        <w:rPr>
-          <w:rFonts w:ascii="Arial" w:hAnsi="Arial" w:cs="Arial"/>
-        </w:rPr>
-        <w:t xml:space="preserve"> de precisão (196</w:t>
-      </w:r>
-      <w:r>
-        <w:rPr>
-          <w:rFonts w:ascii="Arial" w:hAnsi="Arial" w:cs="Arial"/>
-        </w:rPr>
-        <w:t xml:space="preserve"> dos </w:t>
-      </w:r>
-      <w:r>
-        <w:rPr>
-          <w:rFonts w:ascii="Arial" w:hAnsi="Arial" w:cs="Arial"/>
-        </w:rPr>
-        <w:t>294</w:t>
-      </w:r>
-      <w:r>
-        <w:rPr>
-          <w:rFonts w:ascii="Arial" w:hAnsi="Arial" w:cs="Arial"/>
-        </w:rPr>
-        <w:t>)</w:t>
-      </w:r>
-      <w:r>
-        <w:rPr>
-          <w:rFonts w:ascii="Arial" w:hAnsi="Arial" w:cs="Arial"/>
-        </w:rPr>
-        <w:t>, no entanto, devido ao alto desbalanceamento da classe de interesse, a probabilidade calculada raramente passa do limiar padrão de 0,5</w:t>
-      </w:r>
-      <w:r>
-        <w:rPr>
-          <w:rFonts w:ascii="Arial" w:hAnsi="Arial" w:cs="Arial"/>
-        </w:rPr>
-        <w:t xml:space="preserve">, </w:t>
-      </w:r>
-      <w:proofErr w:type="gramStart"/>
-      <w:r>
-        <w:rPr>
-          <w:rFonts w:ascii="Arial" w:hAnsi="Arial" w:cs="Arial"/>
-        </w:rPr>
-        <w:t>o modelo falha</w:t>
-      </w:r>
-      <w:proofErr w:type="gramEnd"/>
-      <w:r>
-        <w:rPr>
-          <w:rFonts w:ascii="Arial" w:hAnsi="Arial" w:cs="Arial"/>
-        </w:rPr>
-        <w:t xml:space="preserve"> em capturar 732 dos 928 clientes potenciais, apresentando um recall de apenas 21,12%</w:t>
-      </w:r>
-      <w:r>
-        <w:rPr>
-          <w:rFonts w:ascii="Arial" w:hAnsi="Arial" w:cs="Arial"/>
-        </w:rPr>
-        <w:t xml:space="preserve">. </w:t>
-      </w:r>
-    </w:p>
-    <w:p>
-      <w:pPr>
-        <w:spacing w:before="240" w:line="240" w:lineRule="auto"/>
-        <w:ind w:firstLine="360"/>
-        <w:jc w:val="both"/>
-        <w:rPr>
-          <w:rFonts w:ascii="Arial" w:hAnsi="Arial" w:cs="Arial"/>
-        </w:rPr>
-      </w:pPr>
-      <w:r>
-        <w:rPr>
-          <w:rFonts w:ascii="Arial" w:hAnsi="Arial" w:cs="Arial"/>
-        </w:rPr>
-        <w:t>Para utilizar a Regressão Logística em ambiente de produção mantendo o foco em maximizar adesões, é indispensável reajustar o limiar decisório</w:t>
-      </w:r>
-      <w:r>
-        <w:rPr>
-          <w:rFonts w:ascii="Arial" w:hAnsi="Arial" w:cs="Arial"/>
-        </w:rPr>
-        <w:t>. Aqui essa ação não foi realizada pois estamos visando a comparação padronizada entre os modelos</w:t>
-      </w:r>
-      <w:r>
-        <w:rPr>
-          <w:rFonts w:ascii="Arial" w:hAnsi="Arial" w:cs="Arial"/>
-        </w:rPr>
-        <w:t xml:space="preserve">, então foi assumido o limiar padrão de 0,5 do </w:t>
-      </w:r>
-      <w:proofErr w:type="spellStart"/>
-      <w:r>
-        <w:rPr>
-          <w:rFonts w:ascii="Arial" w:hAnsi="Arial" w:cs="Arial"/>
-        </w:rPr>
-        <w:t>s</w:t>
-      </w:r>
-      <w:r>
-        <w:rPr>
-          <w:rFonts w:ascii="Arial" w:hAnsi="Arial" w:cs="Arial"/>
-        </w:rPr>
-        <w:t>cikit-learn</w:t>
-      </w:r>
-      <w:proofErr w:type="spellEnd"/>
-      <w:r>
-        <w:rPr>
-          <w:rFonts w:ascii="Arial" w:hAnsi="Arial" w:cs="Arial"/>
-        </w:rPr>
-        <w:t>.</w:t>
-      </w:r>
-    </w:p>
-    <w:p>
-      <w:pPr>
-        <w:spacing w:before="240" w:line="240" w:lineRule="auto"/>
-        <w:jc w:val="both"/>
-        <w:rPr>
-          <w:rFonts w:ascii="Arial" w:hAnsi="Arial" w:cs="Arial"/>
-        </w:rPr>
-      </w:pPr>
-      <w:r>
-        <w:rPr>
-          <w:rFonts w:ascii="Arial" w:hAnsi="Arial" w:cs="Arial"/>
-          <w:noProof/>
+        <w:jc w:val="both"/>
+        <w:rPr>
+          <w:rFonts w:ascii="Arial" w:hAnsi="Arial" w:cs="Arial"/>
+        </w:rPr>
+      </w:pPr>
+      <w:r>
+        <w:rPr>
+          <w:rFonts w:ascii="Arial" w:hAnsi="Arial" w:cs="Arial"/>
         </w:rPr>
         <w:lastRenderedPageBreak/>
         <w:drawing>
-          <wp:inline distT="0" distB="0" distL="0" distR="0" wp14:anchorId="34E07DCE" wp14:editId="62AD2AD6">
-            <wp:extent cx="5400040" cy="1727835"/>
-            <wp:effectExtent l="0" t="0" r="0" b="5715"/>
-            <wp:docPr id="9" name="Imagem 9"/>
+          <wp:inline distT="0" distB="0" distL="0" distR="0" wp14:anchorId="5D678A1B" wp14:editId="2953E28D">
+            <wp:extent cx="5400040" cy="1769110"/>
+            <wp:effectExtent l="0" t="0" r="0" b="2540"/>
+            <wp:docPr id="851703835" name="Imagem 1"/>
             <wp:cNvGraphicFramePr>
               <a:graphicFrameLocks xmlns:a="http://schemas.openxmlformats.org/drawingml/2006/main" noChangeAspect="1"/>
             </wp:cNvGraphicFramePr>
@@ -2972,7 +3004,7 @@
               <a:graphicData uri="http://schemas.openxmlformats.org/drawingml/2006/picture">
                 <pic:pic xmlns:pic="http://schemas.openxmlformats.org/drawingml/2006/picture">
                   <pic:nvPicPr>
-                    <pic:cNvPr id="1" name=""/>
+                    <pic:cNvPr id="851703835" name=""/>
                     <pic:cNvPicPr/>
                   </pic:nvPicPr>
                   <pic:blipFill>
@@ -2984,7 +3016,7 @@
                   <pic:spPr>
                     <a:xfrm>
                       <a:off x="0" y="0"/>
-                      <a:ext cx="5400040" cy="1727835"/>
+                      <a:ext cx="5400040" cy="1769110"/>
                     </a:xfrm>
                     <a:prstGeom prst="rect">
                       <a:avLst/>
@@ -3140,7 +3172,7 @@
       </w:r>
       <w:r>
         <w:pict w14:anchorId="1E47B76D">
-          <v:rect id="_x0000_i1071" style="width:0;height:1.5pt" o:hralign="center" o:hrstd="t" o:hr="t" fillcolor="gray" stroked="f"/>
+          <v:rect id="_x0000_i1029" style="width:0;height:1.5pt" o:hralign="center" o:hrstd="t" o:hr="t" fillcolor="gray" stroked="f"/>
         </w:pict>
       </w:r>
     </w:p>
@@ -3241,7 +3273,7 @@
       </w:r>
       <w:r>
         <w:pict w14:anchorId="463BB2D2">
-          <v:rect id="_x0000_i1072" style="width:0;height:1.5pt" o:hralign="center" o:hrstd="t" o:hr="t" fillcolor="gray" stroked="f"/>
+          <v:rect id="_x0000_i1030" style="width:0;height:1.5pt" o:hralign="center" o:hrstd="t" o:hr="t" fillcolor="gray" stroked="f"/>
         </w:pict>
       </w:r>
     </w:p>
@@ -4815,7 +4847,7 @@
       </w:r>
       <w:r>
         <w:pict w14:anchorId="5E398318">
-          <v:rect id="_x0000_i1073" style="width:0;height:1.5pt" o:hralign="center" o:hrstd="t" o:hr="t" fillcolor="gray" stroked="f"/>
+          <v:rect id="_x0000_i1031" style="width:0;height:1.5pt" o:hralign="center" o:hrstd="t" o:hr="t" fillcolor="gray" stroked="f"/>
         </w:pict>
       </w:r>
     </w:p>
@@ -4901,7 +4933,7 @@
       </w:r>
       <w:r>
         <w:pict w14:anchorId="59ECBA31">
-          <v:rect id="_x0000_i1074" style="width:0;height:1.5pt" o:hralign="center" o:hrstd="t" o:hr="t" fillcolor="gray" stroked="f"/>
+          <v:rect id="_x0000_i1032" style="width:0;height:1.5pt" o:hralign="center" o:hrstd="t" o:hr="t" fillcolor="gray" stroked="f"/>
         </w:pict>
       </w:r>
     </w:p>

</xml_diff>